<commit_message>
Trim lab to Plethora, retitle to Technical Lead — Solutions, add IMSAS + full mission index, de-metric test counts; updated resume
Co-Authored-By: Claude Fable 5 <noreply@anthropic.com>
</commit_message>
<xml_diff>
--- a/Rupan_Resume_Jul_2026.docx
+++ b/Rupan_Resume_Jul_2026.docx
@@ -28,7 +28,7 @@
           <w:sz w:val="25"/>
           <w:szCs w:val="25"/>
         </w:rPr>
-        <w:t xml:space="preserve">Senior Engineer  ·  Project Manager  ·  AI Platform Architect</w:t>
+        <w:t xml:space="preserve">Technical Lead — Solutions  ·  AI Platforms  ·  XR &amp; Real-Time Systems</w:t>
       </w:r>
     </w:p>
     <w:p>
@@ -62,7 +62,7 @@
         <w:pBdr>
           <w:bottom w:val="single" w:color="1F3A5F" w:sz="8" w:space="2"/>
         </w:pBdr>
-        <w:spacing w:after="100" w:before="280"/>
+        <w:spacing w:after="70" w:before="190"/>
       </w:pPr>
       <w:r>
         <w:rPr>
@@ -87,7 +87,7 @@
           <w:sz w:val="21"/>
           <w:szCs w:val="21"/>
         </w:rPr>
-        <w:t xml:space="preserve">Engineer of ten years spanning two hard domains: real-time defense simulation (fighter-jet simulators, ARINC 661 cockpit displays, XR hardware integration) and, since 2024, agentic AI platforms. Currently architecting AI-driven software delivery systems that orchestrate fleets of coding agents through spec, plan, implement, review and QA phases with human approval gates — taking one platform from empty repository to a self-running, 850-tests-green system in 18 days. Comfortable owning everything from GLSL shaders and Ada integration to RAG pipelines, NL-to-SQL engines and air-gapped Linux delivery. Team lead and technical manager for national aerospace and defense R&amp;D programs.</w:t>
+        <w:t xml:space="preserve">Technical Lead — Solutions with ten years spanning two hard domains: real-time defense simulation (fighter-jet simulators, ARINC 661 cockpit displays, maritime situational awareness, XR hardware integration) and, since 2024, agentic AI platforms. Currently architecting AI-driven software delivery systems that orchestrate fleets of coding agents through spec, plan, implement, review and QA phases with human approval gates — taking one platform from empty repository to a self-running system in 18 days. Comfortable owning everything from GLSL shaders and Ada integration to RAG pipelines, NL-to-SQL engines and air-gapped Linux delivery. Team lead and technical manager for national aerospace and defense R&amp;D programs.</w:t>
       </w:r>
     </w:p>
     <w:p>
@@ -95,7 +95,7 @@
         <w:pBdr>
           <w:bottom w:val="single" w:color="1F3A5F" w:sz="8" w:space="2"/>
         </w:pBdr>
-        <w:spacing w:after="100" w:before="280"/>
+        <w:spacing w:after="70" w:before="190"/>
       </w:pPr>
       <w:r>
         <w:rPr>
@@ -230,7 +230,7 @@
         <w:pBdr>
           <w:bottom w:val="single" w:color="1F3A5F" w:sz="8" w:space="2"/>
         </w:pBdr>
-        <w:spacing w:after="100" w:before="280"/>
+        <w:spacing w:after="70" w:before="190"/>
       </w:pPr>
       <w:r>
         <w:rPr>
@@ -250,7 +250,7 @@
         <w:tabs>
           <w:tab w:val="right" w:pos="9026"/>
         </w:tabs>
-        <w:spacing w:after="20" w:before="200"/>
+        <w:spacing w:after="12" w:before="140"/>
       </w:pPr>
       <w:r>
         <w:rPr>
@@ -260,7 +260,7 @@
           <w:sz w:val="22"/>
           <w:szCs w:val="22"/>
         </w:rPr>
-        <w:t xml:space="preserve">Project Manager &amp; AI Platform Architect</w:t>
+        <w:t xml:space="preserve">Technical Lead — Solutions</w:t>
       </w:r>
       <w:r>
         <w:rPr>
@@ -288,7 +288,7 @@
           <w:ilvl w:val="0"/>
           <w:numId w:val="2"/>
         </w:numPr>
-        <w:spacing w:after="30" w:before="30"/>
+        <w:spacing w:after="16" w:before="16"/>
       </w:pPr>
       <w:r>
         <w:rPr>
@@ -305,41 +305,41 @@
           <w:ilvl w:val="0"/>
           <w:numId w:val="2"/>
         </w:numPr>
-        <w:spacing w:after="30" w:before="30"/>
-      </w:pPr>
-      <w:r>
-        <w:rPr>
-          <w:sz w:val="21"/>
-          <w:szCs w:val="21"/>
-        </w:rPr>
-        <w:t xml:space="preserve">Architected and solely built an AI-SDLC orchestration platform driving Claude coding agents through spec → plan → implement → review → QA with human gates: dependency-wave scheduler running 8 parallel agents in isolated git worktrees, automated browser verification of acceptance criteria, code-knowledge-graph context layer, local-model (Ollama) routing for on-premise use. Empty repo to self-running platform in 18 days; 850 tests green in consecutive clean passes.</w:t>
-      </w:r>
-    </w:p>
-    <w:p>
-      <w:pPr>
-        <w:pStyle w:val="ListParagraph"/>
-        <w:numPr>
-          <w:ilvl w:val="0"/>
-          <w:numId w:val="2"/>
-        </w:numPr>
-        <w:spacing w:after="30" w:before="30"/>
-      </w:pPr>
-      <w:r>
-        <w:rPr>
-          <w:sz w:val="21"/>
-          <w:szCs w:val="21"/>
-        </w:rPr>
-        <w:t xml:space="preserve">Delivered an AR quality-inspection product for a manufacturing client from zero to client-ready in 3 weeks: Unity + MRTK3 headset experience, ARCore tablet port at full parity verified on physical hardware (64/64 EditMode, 7/7 E2E tests), plus a React/Express management portal with rework traceability and first-pass-yield analytics.</w:t>
-      </w:r>
-    </w:p>
-    <w:p>
-      <w:pPr>
-        <w:pStyle w:val="ListParagraph"/>
-        <w:numPr>
-          <w:ilvl w:val="0"/>
-          <w:numId w:val="2"/>
-        </w:numPr>
-        <w:spacing w:after="30" w:before="30"/>
+        <w:spacing w:after="16" w:before="16"/>
+      </w:pPr>
+      <w:r>
+        <w:rPr>
+          <w:sz w:val="21"/>
+          <w:szCs w:val="21"/>
+        </w:rPr>
+        <w:t xml:space="preserve">Architected and solely built an AI-SDLC orchestration platform driving Claude coding agents through spec → plan → implement → review → QA with human gates: dependency-wave scheduler running 8 parallel agents in isolated git worktrees, automated browser verification of acceptance criteria, code-knowledge-graph context layer, local-model (Ollama) routing for on-premise use. Empty repo to self-running platform in 18 days.</w:t>
+      </w:r>
+    </w:p>
+    <w:p>
+      <w:pPr>
+        <w:pStyle w:val="ListParagraph"/>
+        <w:numPr>
+          <w:ilvl w:val="0"/>
+          <w:numId w:val="2"/>
+        </w:numPr>
+        <w:spacing w:after="16" w:before="16"/>
+      </w:pPr>
+      <w:r>
+        <w:rPr>
+          <w:sz w:val="21"/>
+          <w:szCs w:val="21"/>
+        </w:rPr>
+        <w:t xml:space="preserve">Delivered an AR quality-inspection product for a manufacturing client from zero to client-ready in 3 weeks: Unity + MRTK3 headset experience, ARCore tablet port at full parity verified on physical hardware with test-driven EditMode and E2E suites, plus a React/Express management portal with rework traceability and first-pass-yield analytics.</w:t>
+      </w:r>
+    </w:p>
+    <w:p>
+      <w:pPr>
+        <w:pStyle w:val="ListParagraph"/>
+        <w:numPr>
+          <w:ilvl w:val="0"/>
+          <w:numId w:val="2"/>
+        </w:numPr>
+        <w:spacing w:after="16" w:before="16"/>
       </w:pPr>
       <w:r>
         <w:rPr>
@@ -356,7 +356,7 @@
           <w:ilvl w:val="0"/>
           <w:numId w:val="2"/>
         </w:numPr>
-        <w:spacing w:after="30" w:before="30"/>
+        <w:spacing w:after="16" w:before="16"/>
       </w:pPr>
       <w:r>
         <w:rPr>
@@ -373,7 +373,7 @@
           <w:ilvl w:val="0"/>
           <w:numId w:val="2"/>
         </w:numPr>
-        <w:spacing w:after="30" w:before="30"/>
+        <w:spacing w:after="16" w:before="16"/>
       </w:pPr>
       <w:r>
         <w:rPr>
@@ -390,7 +390,7 @@
           <w:ilvl w:val="0"/>
           <w:numId w:val="2"/>
         </w:numPr>
-        <w:spacing w:after="30" w:before="30"/>
+        <w:spacing w:after="16" w:before="16"/>
       </w:pPr>
       <w:r>
         <w:rPr>
@@ -405,7 +405,7 @@
         <w:tabs>
           <w:tab w:val="right" w:pos="9026"/>
         </w:tabs>
-        <w:spacing w:after="20" w:before="200"/>
+        <w:spacing w:after="12" w:before="140"/>
       </w:pPr>
       <w:r>
         <w:rPr>
@@ -443,7 +443,7 @@
           <w:ilvl w:val="0"/>
           <w:numId w:val="2"/>
         </w:numPr>
-        <w:spacing w:after="30" w:before="30"/>
+        <w:spacing w:after="16" w:before="16"/>
       </w:pPr>
       <w:r>
         <w:rPr>
@@ -458,7 +458,7 @@
         <w:tabs>
           <w:tab w:val="right" w:pos="9026"/>
         </w:tabs>
-        <w:spacing w:after="20" w:before="200"/>
+        <w:spacing w:after="12" w:before="140"/>
       </w:pPr>
       <w:r>
         <w:rPr>
@@ -496,7 +496,7 @@
           <w:ilvl w:val="0"/>
           <w:numId w:val="2"/>
         </w:numPr>
-        <w:spacing w:after="30" w:before="30"/>
+        <w:spacing w:after="16" w:before="16"/>
       </w:pPr>
       <w:r>
         <w:rPr>
@@ -513,7 +513,7 @@
           <w:ilvl w:val="0"/>
           <w:numId w:val="2"/>
         </w:numPr>
-        <w:spacing w:after="30" w:before="30"/>
+        <w:spacing w:after="16" w:before="16"/>
       </w:pPr>
       <w:r>
         <w:rPr>
@@ -521,6 +521,23 @@
           <w:szCs w:val="21"/>
         </w:rPr>
         <w:t xml:space="preserve">Integrated Epiphan video capture with real-time cropping; UDP video streaming via OpenCV; Ada ↔ C++ integration over DLLs and network protocols for airworthy test units.</w:t>
+      </w:r>
+    </w:p>
+    <w:p>
+      <w:pPr>
+        <w:pStyle w:val="ListParagraph"/>
+        <w:numPr>
+          <w:ilvl w:val="0"/>
+          <w:numId w:val="2"/>
+        </w:numPr>
+        <w:spacing w:after="16" w:before="16"/>
+      </w:pPr>
+      <w:r>
+        <w:rPr>
+          <w:sz w:val="21"/>
+          <w:szCs w:val="21"/>
+        </w:rPr>
+        <w:t xml:space="preserve">Developed IMSAS — Indian Maritime Situational Awareness System: GIS-based real-time common operating picture in Qt/C++ with PostgreSQL storage and Kafka / RabbitMQ event streaming across consoles.</w:t>
       </w:r>
     </w:p>
     <w:p>
@@ -528,7 +545,7 @@
         <w:tabs>
           <w:tab w:val="right" w:pos="9026"/>
         </w:tabs>
-        <w:spacing w:after="20" w:before="200"/>
+        <w:spacing w:after="12" w:before="140"/>
       </w:pPr>
       <w:r>
         <w:rPr>
@@ -566,7 +583,7 @@
           <w:ilvl w:val="0"/>
           <w:numId w:val="2"/>
         </w:numPr>
-        <w:spacing w:after="30" w:before="30"/>
+        <w:spacing w:after="16" w:before="16"/>
       </w:pPr>
       <w:r>
         <w:rPr>
@@ -581,7 +598,7 @@
         <w:tabs>
           <w:tab w:val="right" w:pos="9026"/>
         </w:tabs>
-        <w:spacing w:after="20" w:before="200"/>
+        <w:spacing w:after="12" w:before="140"/>
       </w:pPr>
       <w:r>
         <w:rPr>
@@ -619,7 +636,7 @@
           <w:ilvl w:val="0"/>
           <w:numId w:val="2"/>
         </w:numPr>
-        <w:spacing w:after="30" w:before="30"/>
+        <w:spacing w:after="16" w:before="16"/>
       </w:pPr>
       <w:r>
         <w:rPr>
@@ -634,7 +651,7 @@
         <w:tabs>
           <w:tab w:val="right" w:pos="9026"/>
         </w:tabs>
-        <w:spacing w:after="20" w:before="200"/>
+        <w:spacing w:after="12" w:before="140"/>
       </w:pPr>
       <w:r>
         <w:rPr>
@@ -672,7 +689,7 @@
           <w:ilvl w:val="0"/>
           <w:numId w:val="2"/>
         </w:numPr>
-        <w:spacing w:after="30" w:before="30"/>
+        <w:spacing w:after="16" w:before="16"/>
       </w:pPr>
       <w:r>
         <w:rPr>
@@ -687,7 +704,7 @@
         <w:pBdr>
           <w:bottom w:val="single" w:color="1F3A5F" w:sz="8" w:space="2"/>
         </w:pBdr>
-        <w:spacing w:after="100" w:before="280"/>
+        <w:spacing w:after="70" w:before="190"/>
       </w:pPr>
       <w:r>
         <w:rPr>
@@ -709,7 +726,7 @@
           <w:ilvl w:val="0"/>
           <w:numId w:val="2"/>
         </w:numPr>
-        <w:spacing w:after="30" w:before="30"/>
+        <w:spacing w:after="16" w:before="16"/>
       </w:pPr>
       <w:r>
         <w:rPr>
@@ -735,7 +752,7 @@
           <w:ilvl w:val="0"/>
           <w:numId w:val="2"/>
         </w:numPr>
-        <w:spacing w:after="30" w:before="30"/>
+        <w:spacing w:after="16" w:before="16"/>
       </w:pPr>
       <w:r>
         <w:rPr>
@@ -761,7 +778,7 @@
           <w:ilvl w:val="0"/>
           <w:numId w:val="2"/>
         </w:numPr>
-        <w:spacing w:after="30" w:before="30"/>
+        <w:spacing w:after="16" w:before="16"/>
       </w:pPr>
       <w:r>
         <w:rPr>
@@ -787,7 +804,7 @@
           <w:ilvl w:val="0"/>
           <w:numId w:val="2"/>
         </w:numPr>
-        <w:spacing w:after="30" w:before="30"/>
+        <w:spacing w:after="16" w:before="16"/>
       </w:pPr>
       <w:r>
         <w:rPr>
@@ -813,7 +830,7 @@
           <w:ilvl w:val="0"/>
           <w:numId w:val="2"/>
         </w:numPr>
-        <w:spacing w:after="30" w:before="30"/>
+        <w:spacing w:after="16" w:before="16"/>
       </w:pPr>
       <w:r>
         <w:rPr>
@@ -839,7 +856,7 @@
           <w:ilvl w:val="0"/>
           <w:numId w:val="2"/>
         </w:numPr>
-        <w:spacing w:after="30" w:before="30"/>
+        <w:spacing w:after="16" w:before="16"/>
       </w:pPr>
       <w:r>
         <w:rPr>
@@ -865,23 +882,127 @@
           <w:ilvl w:val="0"/>
           <w:numId w:val="2"/>
         </w:numPr>
-        <w:spacing w:after="30" w:before="30"/>
-      </w:pPr>
-      <w:r>
-        <w:rPr>
-          <w:b/>
-          <w:bCs/>
-          <w:sz w:val="21"/>
-          <w:szCs w:val="21"/>
-        </w:rPr>
-        <w:t xml:space="preserve">Earlier systems: </w:t>
-      </w:r>
-      <w:r>
-        <w:rPr>
-          <w:sz w:val="21"/>
-          <w:szCs w:val="21"/>
-        </w:rPr>
-        <w:t xml:space="preserve">Maritime GIS situational awareness (Qt/C++), AUV software on ROS2/NAV2, synthetic-terrain shaders in FlightGear, LIDAR point-cloud VR walkthroughs with MIT Chennai.</w:t>
+        <w:spacing w:after="16" w:before="16"/>
+      </w:pPr>
+      <w:r>
+        <w:rPr>
+          <w:b/>
+          <w:bCs/>
+          <w:sz w:val="21"/>
+          <w:szCs w:val="21"/>
+        </w:rPr>
+        <w:t xml:space="preserve">IMSAS: </w:t>
+      </w:r>
+      <w:r>
+        <w:rPr>
+          <w:sz w:val="21"/>
+          <w:szCs w:val="21"/>
+        </w:rPr>
+        <w:t xml:space="preserve">Indian Maritime Situational Awareness System — GIS-based real-time common operating picture. Qt, C++, PostgreSQL, Kafka, RabbitMQ.</w:t>
+      </w:r>
+    </w:p>
+    <w:p>
+      <w:pPr>
+        <w:pStyle w:val="ListParagraph"/>
+        <w:numPr>
+          <w:ilvl w:val="0"/>
+          <w:numId w:val="2"/>
+        </w:numPr>
+        <w:spacing w:after="16" w:before="16"/>
+      </w:pPr>
+      <w:r>
+        <w:rPr>
+          <w:b/>
+          <w:bCs/>
+          <w:sz w:val="21"/>
+          <w:szCs w:val="21"/>
+        </w:rPr>
+        <w:t xml:space="preserve">Simulation &amp; CV: </w:t>
+      </w:r>
+      <w:r>
+        <w:rPr>
+          <w:sz w:val="21"/>
+          <w:szCs w:val="21"/>
+        </w:rPr>
+        <w:t xml:space="preserve">Bomb-drop trajectory simulation (FlightGear/Unity), fighter-jet sensors simulation with multi-monitor XLIB windows on Ubuntu, synthetic-terrain shaders in FlightGear, lane-detection CV integration, UDP video streaming via OpenCV.</w:t>
+      </w:r>
+    </w:p>
+    <w:p>
+      <w:pPr>
+        <w:pStyle w:val="ListParagraph"/>
+        <w:numPr>
+          <w:ilvl w:val="0"/>
+          <w:numId w:val="2"/>
+        </w:numPr>
+        <w:spacing w:after="16" w:before="16"/>
+      </w:pPr>
+      <w:r>
+        <w:rPr>
+          <w:b/>
+          <w:bCs/>
+          <w:sz w:val="21"/>
+          <w:szCs w:val="21"/>
+        </w:rPr>
+        <w:t xml:space="preserve">Avionics &amp; robotics: </w:t>
+      </w:r>
+      <w:r>
+        <w:rPr>
+          <w:sz w:val="21"/>
+          <w:szCs w:val="21"/>
+        </w:rPr>
+        <w:t xml:space="preserve">ECFM LRU test-case generation and component testing for an airworthy unit (Ada ↔ C++), AUV ECA-A9 software on ROS2/NAV2, multi-region large-area touch displays in Windows C++.</w:t>
+      </w:r>
+    </w:p>
+    <w:p>
+      <w:pPr>
+        <w:pStyle w:val="ListParagraph"/>
+        <w:numPr>
+          <w:ilvl w:val="0"/>
+          <w:numId w:val="2"/>
+        </w:numPr>
+        <w:spacing w:after="16" w:before="16"/>
+      </w:pPr>
+      <w:r>
+        <w:rPr>
+          <w:b/>
+          <w:bCs/>
+          <w:sz w:val="21"/>
+          <w:szCs w:val="21"/>
+        </w:rPr>
+        <w:t xml:space="preserve">XR &amp; interactive: </w:t>
+      </w:r>
+      <w:r>
+        <w:rPr>
+          <w:sz w:val="21"/>
+          <w:szCs w:val="21"/>
+        </w:rPr>
+        <w:t xml:space="preserve">LIDAR point-cloud VR walkthroughs with MIT Chennai, museum interactives (Puli-Meka multiplayer AI strategy game, 4-way touch table, VR 360° tour), AR sketch app with SLAM anchoring, MMORPG VR building/terrain/networking systems.</w:t>
+      </w:r>
+    </w:p>
+    <w:p>
+      <w:pPr>
+        <w:pStyle w:val="ListParagraph"/>
+        <w:numPr>
+          <w:ilvl w:val="0"/>
+          <w:numId w:val="2"/>
+        </w:numPr>
+        <w:spacing w:after="16" w:before="16"/>
+      </w:pPr>
+      <w:r>
+        <w:rPr>
+          <w:b/>
+          <w:bCs/>
+          <w:sz w:val="21"/>
+          <w:szCs w:val="21"/>
+        </w:rPr>
+        <w:t xml:space="preserve">Self-hosted AI infrastructure: </w:t>
+      </w:r>
+      <w:r>
+        <w:rPr>
+          <w:sz w:val="21"/>
+          <w:szCs w:val="21"/>
+        </w:rPr>
+        <w:t xml:space="preserve">Multimodal LLM management backend and open-source chat platform with user/model access control (Docker), VS Code AI pair-programming rollout on local LLMs, low-latency self-hosted video conferencing.</w:t>
       </w:r>
     </w:p>
     <w:p>
@@ -889,7 +1010,7 @@
         <w:pBdr>
           <w:bottom w:val="single" w:color="1F3A5F" w:sz="8" w:space="2"/>
         </w:pBdr>
-        <w:spacing w:after="100" w:before="280"/>
+        <w:spacing w:after="70" w:before="190"/>
       </w:pPr>
       <w:r>
         <w:rPr>
@@ -909,7 +1030,7 @@
         <w:tabs>
           <w:tab w:val="right" w:pos="9026"/>
         </w:tabs>
-        <w:spacing w:after="20" w:before="200"/>
+        <w:spacing w:after="12" w:before="140"/>
       </w:pPr>
       <w:r>
         <w:rPr>
@@ -938,19 +1059,6 @@
           <w:szCs w:val="20"/>
         </w:rPr>
         <w:t xml:space="preserve">	2012 – 2016</w:t>
-      </w:r>
-    </w:p>
-    <w:p>
-      <w:pPr>
-        <w:spacing w:after="40" w:before="40"/>
-      </w:pPr>
-      <w:r>
-        <w:rPr>
-          <w:color w:val="5A6572"/>
-          <w:sz w:val="20"/>
-          <w:szCs w:val="20"/>
-        </w:rPr>
-        <w:t xml:space="preserve">Final-year project: TollPay online toll-gate payment system. Web developer for symposiums and culturals.</w:t>
       </w:r>
     </w:p>
     <w:sectPr>

</xml_diff>

<commit_message>
Remove 18-days platform-build claim from site and resume
Co-Authored-By: Claude Fable 5 <noreply@anthropic.com>
</commit_message>
<xml_diff>
--- a/Rupan_Resume_Jul_2026.docx
+++ b/Rupan_Resume_Jul_2026.docx
@@ -87,7 +87,7 @@
           <w:sz w:val="21"/>
           <w:szCs w:val="21"/>
         </w:rPr>
-        <w:t xml:space="preserve">Technical Lead — Solutions with ten years spanning two hard domains: real-time defense simulation (fighter-jet simulators, ARINC 661 cockpit displays, maritime situational awareness, XR hardware integration) and, since 2024, agentic AI platforms. Currently architecting AI-driven software delivery systems that orchestrate fleets of coding agents through spec, plan, implement, review and QA phases with human approval gates — taking one platform from empty repository to a self-running system in 18 days. Comfortable owning everything from GLSL shaders and Ada integration to RAG pipelines, NL-to-SQL engines and air-gapped Linux delivery. Team lead and technical manager for national aerospace and defense R&amp;D programs.</w:t>
+        <w:t xml:space="preserve">Technical Lead — Solutions with ten years spanning two hard domains: real-time defense simulation (fighter-jet simulators, ARINC 661 cockpit displays, maritime situational awareness, XR hardware integration) and, since 2024, agentic AI platforms. Currently architecting AI-driven software delivery systems that orchestrate fleets of coding agents through spec, plan, implement, review and QA phases with human approval gates. Comfortable owning everything from GLSL shaders and Ada integration to RAG pipelines, NL-to-SQL engines and air-gapped Linux delivery. Team lead and technical manager for national aerospace and defense R&amp;D programs.</w:t>
       </w:r>
     </w:p>
     <w:p>
@@ -312,7 +312,7 @@
           <w:sz w:val="21"/>
           <w:szCs w:val="21"/>
         </w:rPr>
-        <w:t xml:space="preserve">Architected and solely built an AI-SDLC orchestration platform driving Claude coding agents through spec → plan → implement → review → QA with human gates: dependency-wave scheduler running 8 parallel agents in isolated git worktrees, automated browser verification of acceptance criteria, code-knowledge-graph context layer, local-model (Ollama) routing for on-premise use. Empty repo to self-running platform in 18 days.</w:t>
+        <w:t xml:space="preserve">Architected and solely built an AI-SDLC orchestration platform driving Claude coding agents through spec → plan → implement → review → QA with human gates: dependency-wave scheduler running 8 parallel agents in isolated git worktrees, automated browser verification of acceptance criteria, code-knowledge-graph context layer, local-model (Ollama) routing for on-premise use.</w:t>
       </w:r>
     </w:p>
     <w:p>

</xml_diff>

<commit_message>
Remove 3-weeks and 110+ tasks/week claims from site and resume
Co-Authored-By: Claude Fable 5 <noreply@anthropic.com>
</commit_message>
<xml_diff>
--- a/Rupan_Resume_Jul_2026.docx
+++ b/Rupan_Resume_Jul_2026.docx
@@ -329,7 +329,7 @@
           <w:sz w:val="21"/>
           <w:szCs w:val="21"/>
         </w:rPr>
-        <w:t xml:space="preserve">Delivered an AR quality-inspection product for a manufacturing client from zero to client-ready in 3 weeks: Unity + MRTK3 headset experience, ARCore tablet port at full parity verified on physical hardware with test-driven EditMode and E2E suites, plus a React/Express management portal with rework traceability and first-pass-yield analytics.</w:t>
+        <w:t xml:space="preserve">Delivered an AR quality-inspection product for a manufacturing client : Unity + MRTK3 headset experience, ARCore tablet port at full parity verified on physical hardware with test-driven EditMode and E2E suites, plus a React/Express management portal with rework traceability and first-pass-yield analytics.</w:t>
       </w:r>
     </w:p>
     <w:p>
@@ -381,23 +381,6 @@
           <w:szCs w:val="21"/>
         </w:rPr>
         <w:t xml:space="preserve">Led commercial engineering: tender analysis to costed proposals, WBS/SOW generation tooling, market research across 125 competing agent-orchestration projects, pitch decks and phased rebuild programs (three phases delivered in one weekend).</w:t>
-      </w:r>
-    </w:p>
-    <w:p>
-      <w:pPr>
-        <w:pStyle w:val="ListParagraph"/>
-        <w:numPr>
-          <w:ilvl w:val="0"/>
-          <w:numId w:val="2"/>
-        </w:numPr>
-        <w:spacing w:after="16" w:before="16"/>
-      </w:pPr>
-      <w:r>
-        <w:rPr>
-          <w:sz w:val="21"/>
-          <w:szCs w:val="21"/>
-        </w:rPr>
-        <w:t xml:space="preserve">Sustained throughput of 110+ tracked tasks per week with automated reporting tooling built in-house.</w:t>
       </w:r>
     </w:p>
     <w:p>

</xml_diff>

<commit_message>
Remove all timeline/speed boasts from site and resume
Co-Authored-By: Claude Fable 5 <noreply@anthropic.com>
</commit_message>
<xml_diff>
--- a/Rupan_Resume_Jul_2026.docx
+++ b/Rupan_Resume_Jul_2026.docx
@@ -363,24 +363,24 @@
           <w:sz w:val="21"/>
           <w:szCs w:val="21"/>
         </w:rPr>
-        <w:t xml:space="preserve">Designed and shipped an offline↔online secure data-exchange PoC (ARINC-style signed, encrypted change-set packaging with field-level review) end-to-end in one day.</w:t>
-      </w:r>
-    </w:p>
-    <w:p>
-      <w:pPr>
-        <w:pStyle w:val="ListParagraph"/>
-        <w:numPr>
-          <w:ilvl w:val="0"/>
-          <w:numId w:val="2"/>
-        </w:numPr>
-        <w:spacing w:after="16" w:before="16"/>
-      </w:pPr>
-      <w:r>
-        <w:rPr>
-          <w:sz w:val="21"/>
-          <w:szCs w:val="21"/>
-        </w:rPr>
-        <w:t xml:space="preserve">Led commercial engineering: tender analysis to costed proposals, WBS/SOW generation tooling, market research across 125 competing agent-orchestration projects, pitch decks and phased rebuild programs (three phases delivered in one weekend).</w:t>
+        <w:t xml:space="preserve">Designed and shipped an offline↔online secure data-exchange PoC (ARINC-style signed, encrypted change-set packaging with field-level review).</w:t>
+      </w:r>
+    </w:p>
+    <w:p>
+      <w:pPr>
+        <w:pStyle w:val="ListParagraph"/>
+        <w:numPr>
+          <w:ilvl w:val="0"/>
+          <w:numId w:val="2"/>
+        </w:numPr>
+        <w:spacing w:after="16" w:before="16"/>
+      </w:pPr>
+      <w:r>
+        <w:rPr>
+          <w:sz w:val="21"/>
+          <w:szCs w:val="21"/>
+        </w:rPr>
+        <w:t xml:space="preserve">Led commercial engineering: tender analysis to costed proposals, WBS/SOW generation tooling, market research across 125 competing agent-orchestration projects, pitch decks and phased rebuild programs.</w:t>
       </w:r>
     </w:p>
     <w:p>
@@ -751,7 +751,7 @@
           <w:sz w:val="21"/>
           <w:szCs w:val="21"/>
         </w:rPr>
-        <w:t xml:space="preserve">AR quality inspection for manufacturing — headset + tablet parity, TDD throughout, nine feature updates shipped in a single day.</w:t>
+        <w:t xml:space="preserve">AR quality inspection for manufacturing — headset + tablet parity, TDD throughout.</w:t>
       </w:r>
     </w:p>
     <w:p>

</xml_diff>